<commit_message>
docs: update QR (unified entry) + docx (name+sid login)
</commit_message>
<xml_diff>
--- a/使用说明_班主任班级管理系统.docx
+++ b/使用说明_班主任班级管理系统.docx
@@ -65,7 +65,7 @@
         <w:rPr>
           <w:rFonts w:ascii="微软雅黑" w:hAnsi="微软雅黑" w:eastAsia="微软雅黑"/>
         </w:rPr>
-        <w:t>学生端：初始账号密码均为学号，首次登录强制修改密码；填写个人档案（家庭/心理）、每月学习记录（学习状态/疑惑/心情/恋爱/生活，仅自己可见，教师与家长可看）；查看本人课表与成绩。</w:t>
+        <w:t>学生端：用「姓名 + 学号」登录；填写个人档案（家庭/心理）、每月学习记录（学习状态/疑惑/心情/恋爱/生活，仅自己可见，教师与家长可看）；查看本人课表与成绩。</w:t>
       </w:r>
     </w:p>
     <w:p>
@@ -76,7 +76,7 @@
         <w:rPr>
           <w:rFonts w:ascii="微软雅黑" w:hAnsi="微软雅黑" w:eastAsia="微软雅黑"/>
         </w:rPr>
-        <w:t>家长端：扫描孩子的专属家长二维码进入，只读查看自己孩子的学习、家庭、心理情况。</w:t>
+        <w:t>家长端：用孩子的「姓名 + 学号」登录，只读查看自己孩子的学习、家庭、心理情况。</w:t>
       </w:r>
     </w:p>
     <w:p>
@@ -161,29 +161,7 @@
           <w:rFonts w:ascii="微软雅黑" w:hAnsi="微软雅黑" w:eastAsia="微软雅黑"/>
           <w:b w:val="0"/>
         </w:rPr>
-        <w:t>系统提供两类二维码：</w:t>
-      </w:r>
-    </w:p>
-    <w:p>
-      <w:pPr>
-        <w:pStyle w:val="ListBullet"/>
-      </w:pPr>
-      <w:r>
-        <w:rPr>
-          <w:rFonts w:ascii="微软雅黑" w:hAnsi="微软雅黑" w:eastAsia="微软雅黑"/>
-        </w:rPr>
-        <w:t>三个终端入口码（下图）：教师、学生、家长分别扫码/访问进入对应入口页。</w:t>
-      </w:r>
-    </w:p>
-    <w:p>
-      <w:pPr>
-        <w:pStyle w:val="ListBullet"/>
-      </w:pPr>
-      <w:r>
-        <w:rPr>
-          <w:rFonts w:ascii="微软雅黑" w:hAnsi="微软雅黑" w:eastAsia="微软雅黑"/>
-        </w:rPr>
-        <w:t>每生专属二维码：由教师端「每生二维码」页一键生成，包含“学生码”与“家长码”，学生扫码填表/查看自己，家长扫码查看自己孩子。可逐个下载或打印全部。</w:t>
+        <w:t>系统为三个终端各提供一个统一入口二维码（下图）：教师端、学生端、家长端分别扫码/访问进入对应入口页。学生端与家长端不再为每人单独生成二维码，统一使用对应入口码即可。</w:t>
       </w:r>
     </w:p>
     <w:p>
@@ -192,7 +170,7 @@
           <w:rFonts w:ascii="微软雅黑" w:hAnsi="微软雅黑" w:eastAsia="微软雅黑"/>
           <w:b w:val="0"/>
         </w:rPr>
-        <w:t>（部署后如需离线批量生成每生码，运行：python _gen_qr.py students roster.csv，CSV 表头 sid,name,token_student,token_parent）</w:t>
+        <w:t>二维码均在教师端「系统二维码」页实时生成（基于当前公网域名），可逐项下载或整页打印。</w:t>
       </w:r>
     </w:p>
     <w:p/>
@@ -204,7 +182,7 @@
         <w:rPr>
           <w:rFonts w:ascii="微软雅黑" w:hAnsi="微软雅黑" w:eastAsia="微软雅黑"/>
         </w:rPr>
-        <w:t>终端入口二维码</w:t>
+        <w:t>终端入口二维码（学生端、家长端各一个，统一管理）</w:t>
       </w:r>
     </w:p>
     <w:p>
@@ -318,7 +296,7 @@
           <w:rFonts w:ascii="微软雅黑" w:hAnsi="微软雅黑" w:eastAsia="微软雅黑"/>
           <w:b/>
         </w:rPr>
-        <w:t>家长端入口（家长实际用每生专属家长码进入）</w:t>
+        <w:t>家长端入口</w:t>
       </w:r>
     </w:p>
     <w:p>
@@ -401,7 +379,7 @@
         <w:rPr>
           <w:rFonts w:ascii="微软雅黑" w:hAnsi="微软雅黑" w:eastAsia="微软雅黑"/>
         </w:rPr>
-        <w:t>进入「每生二维码」：系统为每位学生自动生成学生码与家长码；家长码打印后发放给对应家长。</w:t>
+        <w:t>进入「系统二维码」：页面展示教师端、学生端、家长端三个统一入口码，下载或打印后分发；学生端与家长端各用一个入口码，登录时用「姓名 + 学号」。</w:t>
       </w:r>
     </w:p>
     <w:p>
@@ -467,7 +445,7 @@
         <w:rPr>
           <w:rFonts w:ascii="微软雅黑" w:hAnsi="微软雅黑" w:eastAsia="微软雅黑"/>
         </w:rPr>
-        <w:t>用学号登录，初始密码同为学号；首次登录弹窗强制修改密码（至少 4 位）。</w:t>
+        <w:t>用「姓名 + 学号」登录（与花名册中录入的一致）。</w:t>
       </w:r>
     </w:p>
     <w:p>
@@ -505,17 +483,6 @@
     </w:p>
     <w:p>
       <w:pPr>
-        <w:pStyle w:val="ListNumber"/>
-      </w:pPr>
-      <w:r>
-        <w:rPr>
-          <w:rFonts w:ascii="微软雅黑" w:hAnsi="微软雅黑" w:eastAsia="微软雅黑"/>
-        </w:rPr>
-        <w:t>也可直接扫描班主任提供的“学生专属码”免密进入（仅本人）。</w:t>
-      </w:r>
-    </w:p>
-    <w:p>
-      <w:pPr>
         <w:pStyle w:val="Heading1"/>
       </w:pPr>
       <w:r>
@@ -533,7 +500,7 @@
         <w:rPr>
           <w:rFonts w:ascii="微软雅黑" w:hAnsi="微软雅黑" w:eastAsia="微软雅黑"/>
         </w:rPr>
-        <w:t>扫描班主任发放的“家长专属码”（含孩子学号与令牌）进入。</w:t>
+        <w:t>用孩子的「姓名 + 学号」登录（与花名册中录入的一致）。</w:t>
       </w:r>
     </w:p>
     <w:p>
@@ -555,7 +522,7 @@
         <w:rPr>
           <w:rFonts w:ascii="微软雅黑" w:hAnsi="微软雅黑" w:eastAsia="微软雅黑"/>
         </w:rPr>
-        <w:t>若提示二维码无效，请联系班主任重新生成最新家长码。</w:t>
+        <w:t>家长端与学生端共用同一个家长入口二维码，扫码进入登录页即可。</w:t>
       </w:r>
     </w:p>
     <w:p>
@@ -643,7 +610,7 @@
         <w:rPr>
           <w:rFonts w:ascii="微软雅黑" w:hAnsi="微软雅黑" w:eastAsia="微软雅黑"/>
         </w:rPr>
-        <w:t>学生忘记密码：教师无法直接重置，可让其用专属学生码扫码进入后在「修改密码」中操作；或联系管理员在 D1 将该生 pwd_changed 置 0 并密码改回学号。</w:t>
+        <w:t>学生/家长登录失败：请确认输入的「姓名」与「学号」与教师端花名册完全一致（含空格）。系统不再使用密码，凭姓名 + 学号即可登录。</w:t>
       </w:r>
     </w:p>
     <w:p>
@@ -654,7 +621,7 @@
         <w:rPr>
           <w:rFonts w:ascii="微软雅黑" w:hAnsi="微软雅黑" w:eastAsia="微软雅黑"/>
         </w:rPr>
-        <w:t>家长码失效：每生家长令牌固定，若怀疑泄露可在 D1 重置 token_parent 并重新打印。</w:t>
+        <w:t>家长入口二维码失效：统一入口码长期有效，若域名变更请用教师端「系统二维码」页重新下载打印。</w:t>
       </w:r>
     </w:p>
     <w:p>

</xml_diff>